<commit_message>
fix dml scripts and add ddl scripts
</commit_message>
<xml_diff>
--- a/homework 4/Результаты скриптов.docx
+++ b/homework 4/Результаты скриптов.docx
@@ -2,7 +2,7 @@
 <file path=word/document.xml><?xml version="1.0" encoding="utf-8"?>
 <w:document xmlns:wpc="http://schemas.microsoft.com/office/word/2010/wordprocessingCanvas" xmlns:mc="http://schemas.openxmlformats.org/markup-compatibility/2006" xmlns:o="urn:schemas-microsoft-com:office:office" xmlns:r="http://schemas.openxmlformats.org/officeDocument/2006/relationships" xmlns:m="http://schemas.openxmlformats.org/officeDocument/2006/math" xmlns:v="urn:schemas-microsoft-com:vml" xmlns:wp14="http://schemas.microsoft.com/office/word/2010/wordprocessingDrawing" xmlns:wp="http://schemas.openxmlformats.org/drawingml/2006/wordprocessingDrawing" xmlns:w10="urn:schemas-microsoft-com:office:word" xmlns:w="http://schemas.openxmlformats.org/wordprocessingml/2006/main" xmlns:w14="http://schemas.microsoft.com/office/word/2010/wordml" xmlns:w15="http://schemas.microsoft.com/office/word/2012/wordml" xmlns:wpg="http://schemas.microsoft.com/office/word/2010/wordprocessingGroup" xmlns:wpi="http://schemas.microsoft.com/office/word/2010/wordprocessingInk" xmlns:wne="http://schemas.microsoft.com/office/word/2006/wordml" xmlns:wps="http://schemas.microsoft.com/office/word/2010/wordprocessingShape" xmlns:w16se="http://schemas.microsoft.com/office/word/2015/wordml/symex" xmlns:w16cid="http://schemas.microsoft.com/office/word/2016/wordml/cid" xmlns:w16="http://schemas.microsoft.com/office/word/2018/wordml" xmlns:w16cex="http://schemas.microsoft.com/office/word/2018/wordml/cex" xmlns:w16sdtdh="http://schemas.microsoft.com/office/word/2020/wordml/sdtdatahash" xmlns:w16sdtfl="http://schemas.microsoft.com/office/word/2024/wordml/sdtformatlock" xmlns:a="http://schemas.openxmlformats.org/drawingml/2006/main" xmlns:pic="http://schemas.openxmlformats.org/drawingml/2006/picture" xmlns:a14="http://schemas.microsoft.com/office/drawing/2010/main" mc:Ignorable="w14 w15 wp14 w16se w16cid w16 w16cex w16sdtdh w16sdtfl">
   <w:body>
-    <w:p xmlns:wp14="http://schemas.microsoft.com/office/word/2010/wordml" wp14:paraId="501817AE" wp14:textId="1B303B89">
+    <w:p xmlns:wp14="http://schemas.microsoft.com/office/word/2010/wordml" wp14:paraId="501817AE" wp14:textId="5E71F88E">
       <w:pPr>
         <w:rPr>
           <w:b w:val="0"/>
@@ -66,7 +66,7 @@
       </w:r>
       <w:r>
         <w:drawing>
-          <wp:inline wp14:editId="56F7E9D4" wp14:anchorId="0558C8EE">
+          <wp:inline wp14:editId="02E71186" wp14:anchorId="0558C8EE">
             <wp:extent cx="5219170" cy="1858406"/>
             <wp:effectExtent l="0" t="0" r="0" b="0"/>
             <wp:docPr id="1818132473" name="drawing"/>
@@ -109,7 +109,7 @@
       </w:r>
       <w:r>
         <w:drawing>
-          <wp:inline wp14:editId="69300C7E" wp14:anchorId="4E2BF93F">
+          <wp:inline wp14:editId="1C323438" wp14:anchorId="4E2BF93F">
             <wp:extent cx="3286584" cy="1364647"/>
             <wp:effectExtent l="0" t="0" r="0" b="0"/>
             <wp:docPr id="1480702546" name="drawing"/>
@@ -189,7 +189,7 @@
       </w:r>
       <w:r>
         <w:drawing>
-          <wp:inline wp14:editId="0E2FF6D1" wp14:anchorId="475554F6">
+          <wp:inline wp14:editId="17AED17A" wp14:anchorId="475554F6">
             <wp:extent cx="5724525" cy="1838325"/>
             <wp:effectExtent l="0" t="0" r="0" b="0"/>
             <wp:docPr id="912129996" name="drawing"/>
@@ -257,7 +257,7 @@
       </w:pPr>
       <w:r>
         <w:drawing>
-          <wp:inline wp14:editId="49E43C04" wp14:anchorId="7EF946DD">
+          <wp:inline wp14:editId="19CB7EC7" wp14:anchorId="7EF946DD">
             <wp:extent cx="4563112" cy="1886213"/>
             <wp:effectExtent l="0" t="0" r="0" b="0"/>
             <wp:docPr id="456670700" name="drawing"/>
@@ -329,7 +329,7 @@
       </w:pPr>
       <w:r>
         <w:drawing>
-          <wp:inline wp14:editId="042CBBE4" wp14:anchorId="3B76F0A8">
+          <wp:inline wp14:editId="38C458BB" wp14:anchorId="3B76F0A8">
             <wp:extent cx="4553586" cy="2248214"/>
             <wp:effectExtent l="0" t="0" r="0" b="0"/>
             <wp:docPr id="940524826" name="drawing"/>
@@ -381,7 +381,7 @@
       </w:pPr>
       <w:r>
         <w:drawing>
-          <wp:inline wp14:editId="2E7495F9" wp14:anchorId="287DDD80">
+          <wp:inline wp14:editId="6C71CDC0" wp14:anchorId="287DDD80">
             <wp:extent cx="5724525" cy="1447800"/>
             <wp:effectExtent l="0" t="0" r="0" b="0"/>
             <wp:docPr id="1654052815" name="drawing"/>
@@ -446,7 +446,7 @@
       </w:pPr>
       <w:r>
         <w:drawing>
-          <wp:inline wp14:editId="2999D4D7" wp14:anchorId="17959D80">
+          <wp:inline wp14:editId="491AD299" wp14:anchorId="17959D80">
             <wp:extent cx="3972479" cy="1838582"/>
             <wp:effectExtent l="0" t="0" r="0" b="0"/>
             <wp:docPr id="572468284" name="drawing"/>
@@ -498,7 +498,7 @@
       </w:pPr>
       <w:r>
         <w:drawing>
-          <wp:inline wp14:editId="15807C6C" wp14:anchorId="7D508AE7">
+          <wp:inline wp14:editId="6B06919D" wp14:anchorId="7D508AE7">
             <wp:extent cx="5295900" cy="1797610"/>
             <wp:effectExtent l="0" t="0" r="0" b="0"/>
             <wp:docPr id="794908024" name="drawing"/>
@@ -563,7 +563,7 @@
       </w:pPr>
       <w:r>
         <w:drawing>
-          <wp:inline wp14:editId="06664C35" wp14:anchorId="305E9B9A">
+          <wp:inline wp14:editId="41FB7762" wp14:anchorId="305E9B9A">
             <wp:extent cx="5724525" cy="1876425"/>
             <wp:effectExtent l="0" t="0" r="0" b="0"/>
             <wp:docPr id="1143512201" name="drawing"/>
@@ -613,6 +613,548 @@
         <w:ind w:left="0" w:right="0"/>
         <w:jc w:val="left"/>
       </w:pPr>
+      <w:r>
+        <w:rPr/>
+        <w:t xml:space="preserve">DDL </w:t>
+      </w:r>
+    </w:p>
+    <w:p>
+      <w:pPr>
+        <w:pStyle w:val="ListParagraph"/>
+        <w:bidi w:val="0"/>
+        <w:spacing w:before="0" w:beforeAutospacing="off" w:after="160" w:afterAutospacing="off" w:line="279" w:lineRule="auto"/>
+        <w:ind w:left="720" w:right="0"/>
+        <w:jc w:val="left"/>
+      </w:pPr>
+      <w:r>
+        <w:rPr/>
+        <w:t>1.</w:t>
+      </w:r>
+    </w:p>
+    <w:p>
+      <w:pPr>
+        <w:pStyle w:val="Normal"/>
+        <w:bidi w:val="0"/>
+        <w:spacing w:before="0" w:beforeAutospacing="off" w:after="160" w:afterAutospacing="off" w:line="279" w:lineRule="auto"/>
+        <w:ind w:left="708" w:right="0"/>
+        <w:jc w:val="left"/>
+      </w:pPr>
+      <w:r>
+        <w:drawing>
+          <wp:inline wp14:editId="1E39E4E3" wp14:anchorId="55D158BC">
+            <wp:extent cx="5724525" cy="2019300"/>
+            <wp:effectExtent l="0" t="0" r="0" b="0"/>
+            <wp:docPr id="208793662" name="drawing"/>
+            <wp:cNvGraphicFramePr>
+              <a:graphicFrameLocks noChangeAspect="1"/>
+            </wp:cNvGraphicFramePr>
+            <a:graphic>
+              <a:graphicData xmlns:a="http://schemas.openxmlformats.org/drawingml/2006/main" uri="http://schemas.openxmlformats.org/drawingml/2006/picture">
+                <pic:pic xmlns:pic="http://schemas.openxmlformats.org/drawingml/2006/picture">
+                  <pic:nvPicPr>
+                    <pic:cNvPr id="208793662" name="Picture 208793662"/>
+                    <pic:cNvPicPr/>
+                  </pic:nvPicPr>
+                  <pic:blipFill>
+                    <a:blip xmlns:r="http://schemas.openxmlformats.org/officeDocument/2006/relationships" r:embed="rId2064248839">
+                      <a:extLst>
+                        <a:ext uri="{28A0092B-C50C-407E-A947-70E740481C1C}">
+                          <a14:useLocalDpi xmlns:a14="http://schemas.microsoft.com/office/drawing/2010/main"/>
+                        </a:ext>
+                      </a:extLst>
+                    </a:blip>
+                    <a:stretch>
+                      <a:fillRect/>
+                    </a:stretch>
+                  </pic:blipFill>
+                  <pic:spPr>
+                    <a:xfrm>
+                      <a:off x="0" y="0"/>
+                      <a:ext cx="5724525" cy="2019300"/>
+                    </a:xfrm>
+                    <a:prstGeom prst="rect">
+                      <a:avLst/>
+                    </a:prstGeom>
+                  </pic:spPr>
+                </pic:pic>
+              </a:graphicData>
+            </a:graphic>
+          </wp:inline>
+        </w:drawing>
+      </w:r>
+      <w:r>
+        <w:drawing>
+          <wp:inline wp14:editId="21F211B2" wp14:anchorId="1B2D36E2">
+            <wp:extent cx="4944165" cy="1028844"/>
+            <wp:effectExtent l="0" t="0" r="0" b="0"/>
+            <wp:docPr id="175872906" name="drawing"/>
+            <wp:cNvGraphicFramePr>
+              <a:graphicFrameLocks noChangeAspect="1"/>
+            </wp:cNvGraphicFramePr>
+            <a:graphic>
+              <a:graphicData xmlns:a="http://schemas.openxmlformats.org/drawingml/2006/main" uri="http://schemas.openxmlformats.org/drawingml/2006/picture">
+                <pic:pic xmlns:pic="http://schemas.openxmlformats.org/drawingml/2006/picture">
+                  <pic:nvPicPr>
+                    <pic:cNvPr id="175872906" name="Picture 175872906"/>
+                    <pic:cNvPicPr/>
+                  </pic:nvPicPr>
+                  <pic:blipFill>
+                    <a:blip xmlns:r="http://schemas.openxmlformats.org/officeDocument/2006/relationships" r:embed="rId580189000">
+                      <a:extLst>
+                        <a:ext uri="{28A0092B-C50C-407E-A947-70E740481C1C}">
+                          <a14:useLocalDpi xmlns:a14="http://schemas.microsoft.com/office/drawing/2010/main"/>
+                        </a:ext>
+                      </a:extLst>
+                    </a:blip>
+                    <a:stretch>
+                      <a:fillRect/>
+                    </a:stretch>
+                  </pic:blipFill>
+                  <pic:spPr>
+                    <a:xfrm>
+                      <a:off x="0" y="0"/>
+                      <a:ext cx="4944165" cy="1028844"/>
+                    </a:xfrm>
+                    <a:prstGeom prst="rect">
+                      <a:avLst/>
+                    </a:prstGeom>
+                  </pic:spPr>
+                </pic:pic>
+              </a:graphicData>
+            </a:graphic>
+          </wp:inline>
+        </w:drawing>
+      </w:r>
+    </w:p>
+    <w:p>
+      <w:pPr>
+        <w:pStyle w:val="Normal"/>
+        <w:bidi w:val="0"/>
+        <w:spacing w:before="0" w:beforeAutospacing="off" w:after="160" w:afterAutospacing="off" w:line="279" w:lineRule="auto"/>
+        <w:ind w:left="708" w:right="0"/>
+        <w:jc w:val="left"/>
+      </w:pPr>
+      <w:r>
+        <w:rPr/>
+        <w:t>2.</w:t>
+      </w:r>
+    </w:p>
+    <w:p>
+      <w:pPr>
+        <w:pStyle w:val="Normal"/>
+        <w:bidi w:val="0"/>
+        <w:spacing w:before="0" w:beforeAutospacing="off" w:after="160" w:afterAutospacing="off" w:line="279" w:lineRule="auto"/>
+        <w:ind w:left="708" w:right="0"/>
+        <w:jc w:val="left"/>
+      </w:pPr>
+      <w:r>
+        <w:drawing>
+          <wp:inline wp14:editId="15BDEC04" wp14:anchorId="39301D3B">
+            <wp:extent cx="3391197" cy="1343212"/>
+            <wp:effectExtent l="0" t="0" r="0" b="0"/>
+            <wp:docPr id="870786914" name="drawing"/>
+            <wp:cNvGraphicFramePr>
+              <a:graphicFrameLocks noChangeAspect="1"/>
+            </wp:cNvGraphicFramePr>
+            <a:graphic>
+              <a:graphicData xmlns:a="http://schemas.openxmlformats.org/drawingml/2006/main" uri="http://schemas.openxmlformats.org/drawingml/2006/picture">
+                <pic:pic xmlns:pic="http://schemas.openxmlformats.org/drawingml/2006/picture">
+                  <pic:nvPicPr>
+                    <pic:cNvPr id="870786914" name="Picture 870786914"/>
+                    <pic:cNvPicPr/>
+                  </pic:nvPicPr>
+                  <pic:blipFill>
+                    <a:blip xmlns:r="http://schemas.openxmlformats.org/officeDocument/2006/relationships" r:embed="rId2031885500">
+                      <a:extLst>
+                        <a:ext uri="{28A0092B-C50C-407E-A947-70E740481C1C}">
+                          <a14:useLocalDpi xmlns:a14="http://schemas.microsoft.com/office/drawing/2010/main"/>
+                        </a:ext>
+                      </a:extLst>
+                    </a:blip>
+                    <a:stretch>
+                      <a:fillRect/>
+                    </a:stretch>
+                  </pic:blipFill>
+                  <pic:spPr>
+                    <a:xfrm rot="0">
+                      <a:off x="0" y="0"/>
+                      <a:ext cx="3391197" cy="1343212"/>
+                    </a:xfrm>
+                    <a:prstGeom prst="rect">
+                      <a:avLst/>
+                    </a:prstGeom>
+                  </pic:spPr>
+                </pic:pic>
+              </a:graphicData>
+            </a:graphic>
+          </wp:inline>
+        </w:drawing>
+      </w:r>
+    </w:p>
+    <w:p>
+      <w:pPr>
+        <w:pStyle w:val="Normal"/>
+        <w:bidi w:val="0"/>
+        <w:spacing w:before="0" w:beforeAutospacing="off" w:after="160" w:afterAutospacing="off" w:line="279" w:lineRule="auto"/>
+        <w:ind w:left="708" w:right="0" w:firstLine="0"/>
+        <w:jc w:val="left"/>
+      </w:pPr>
+      <w:r>
+        <w:drawing>
+          <wp:inline wp14:editId="60E97D24" wp14:anchorId="76AEA2EC">
+            <wp:extent cx="4614690" cy="1305320"/>
+            <wp:effectExtent l="0" t="0" r="0" b="0"/>
+            <wp:docPr id="169525315" name="drawing"/>
+            <wp:cNvGraphicFramePr>
+              <a:graphicFrameLocks noChangeAspect="1"/>
+            </wp:cNvGraphicFramePr>
+            <a:graphic>
+              <a:graphicData xmlns:a="http://schemas.openxmlformats.org/drawingml/2006/main" uri="http://schemas.openxmlformats.org/drawingml/2006/picture">
+                <pic:pic xmlns:pic="http://schemas.openxmlformats.org/drawingml/2006/picture">
+                  <pic:nvPicPr>
+                    <pic:cNvPr id="169525315" name="Picture 169525315"/>
+                    <pic:cNvPicPr/>
+                  </pic:nvPicPr>
+                  <pic:blipFill>
+                    <a:blip xmlns:r="http://schemas.openxmlformats.org/officeDocument/2006/relationships" r:embed="rId974000797">
+                      <a:extLst>
+                        <a:ext uri="{28A0092B-C50C-407E-A947-70E740481C1C}">
+                          <a14:useLocalDpi xmlns:a14="http://schemas.microsoft.com/office/drawing/2010/main"/>
+                        </a:ext>
+                      </a:extLst>
+                    </a:blip>
+                    <a:stretch>
+                      <a:fillRect/>
+                    </a:stretch>
+                  </pic:blipFill>
+                  <pic:spPr>
+                    <a:xfrm rot="0">
+                      <a:off x="0" y="0"/>
+                      <a:ext cx="4614690" cy="1305320"/>
+                    </a:xfrm>
+                    <a:prstGeom prst="rect">
+                      <a:avLst/>
+                    </a:prstGeom>
+                  </pic:spPr>
+                </pic:pic>
+              </a:graphicData>
+            </a:graphic>
+          </wp:inline>
+        </w:drawing>
+      </w:r>
+      <w:r>
+        <w:rPr/>
+        <w:t>3.</w:t>
+      </w:r>
+    </w:p>
+    <w:p>
+      <w:pPr>
+        <w:pStyle w:val="Normal"/>
+        <w:bidi w:val="0"/>
+        <w:spacing w:before="0" w:beforeAutospacing="off" w:after="160" w:afterAutospacing="off" w:line="279" w:lineRule="auto"/>
+        <w:ind w:left="708" w:right="0" w:firstLine="0"/>
+        <w:jc w:val="left"/>
+      </w:pPr>
+      <w:r>
+        <w:drawing>
+          <wp:inline wp14:editId="68B2DE15" wp14:anchorId="72BBB365">
+            <wp:extent cx="3115110" cy="1455805"/>
+            <wp:effectExtent l="0" t="0" r="0" b="0"/>
+            <wp:docPr id="1425861267" name="drawing"/>
+            <wp:cNvGraphicFramePr>
+              <a:graphicFrameLocks noChangeAspect="1"/>
+            </wp:cNvGraphicFramePr>
+            <a:graphic>
+              <a:graphicData xmlns:a="http://schemas.openxmlformats.org/drawingml/2006/main" uri="http://schemas.openxmlformats.org/drawingml/2006/picture">
+                <pic:pic xmlns:pic="http://schemas.openxmlformats.org/drawingml/2006/picture">
+                  <pic:nvPicPr>
+                    <pic:cNvPr id="1425861267" name="Picture 1425861267"/>
+                    <pic:cNvPicPr/>
+                  </pic:nvPicPr>
+                  <pic:blipFill>
+                    <a:blip xmlns:r="http://schemas.openxmlformats.org/officeDocument/2006/relationships" r:embed="rId2033629675">
+                      <a:extLst>
+                        <a:ext uri="{28A0092B-C50C-407E-A947-70E740481C1C}">
+                          <a14:useLocalDpi xmlns:a14="http://schemas.microsoft.com/office/drawing/2010/main"/>
+                        </a:ext>
+                      </a:extLst>
+                    </a:blip>
+                    <a:stretch>
+                      <a:fillRect/>
+                    </a:stretch>
+                  </pic:blipFill>
+                  <pic:spPr>
+                    <a:xfrm rot="0">
+                      <a:off x="0" y="0"/>
+                      <a:ext cx="3115110" cy="1455805"/>
+                    </a:xfrm>
+                    <a:prstGeom prst="rect">
+                      <a:avLst/>
+                    </a:prstGeom>
+                  </pic:spPr>
+                </pic:pic>
+              </a:graphicData>
+            </a:graphic>
+          </wp:inline>
+        </w:drawing>
+      </w:r>
+    </w:p>
+    <w:p>
+      <w:pPr>
+        <w:pStyle w:val="Normal"/>
+        <w:bidi w:val="0"/>
+        <w:spacing w:before="0" w:beforeAutospacing="off" w:after="160" w:afterAutospacing="off" w:line="279" w:lineRule="auto"/>
+        <w:ind w:left="708" w:right="0" w:firstLine="0"/>
+        <w:jc w:val="left"/>
+      </w:pPr>
+      <w:r>
+        <w:drawing>
+          <wp:inline wp14:editId="1E061E4C" wp14:anchorId="2D32D4BA">
+            <wp:extent cx="5048250" cy="1562354"/>
+            <wp:effectExtent l="0" t="0" r="0" b="0"/>
+            <wp:docPr id="1428826498" name="drawing"/>
+            <wp:cNvGraphicFramePr>
+              <a:graphicFrameLocks noChangeAspect="1"/>
+            </wp:cNvGraphicFramePr>
+            <a:graphic>
+              <a:graphicData xmlns:a="http://schemas.openxmlformats.org/drawingml/2006/main" uri="http://schemas.openxmlformats.org/drawingml/2006/picture">
+                <pic:pic xmlns:pic="http://schemas.openxmlformats.org/drawingml/2006/picture">
+                  <pic:nvPicPr>
+                    <pic:cNvPr id="1428826498" name="Picture 1428826498"/>
+                    <pic:cNvPicPr/>
+                  </pic:nvPicPr>
+                  <pic:blipFill>
+                    <a:blip xmlns:r="http://schemas.openxmlformats.org/officeDocument/2006/relationships" r:embed="rId973209514">
+                      <a:extLst>
+                        <a:ext uri="{28A0092B-C50C-407E-A947-70E740481C1C}">
+                          <a14:useLocalDpi xmlns:a14="http://schemas.microsoft.com/office/drawing/2010/main"/>
+                        </a:ext>
+                      </a:extLst>
+                    </a:blip>
+                    <a:stretch>
+                      <a:fillRect/>
+                    </a:stretch>
+                  </pic:blipFill>
+                  <pic:spPr>
+                    <a:xfrm rot="0">
+                      <a:off x="0" y="0"/>
+                      <a:ext cx="5048250" cy="1562354"/>
+                    </a:xfrm>
+                    <a:prstGeom prst="rect">
+                      <a:avLst/>
+                    </a:prstGeom>
+                  </pic:spPr>
+                </pic:pic>
+              </a:graphicData>
+            </a:graphic>
+          </wp:inline>
+        </w:drawing>
+      </w:r>
+      <w:r>
+        <w:rPr/>
+        <w:t>4.</w:t>
+      </w:r>
+    </w:p>
+    <w:p>
+      <w:pPr>
+        <w:pStyle w:val="Normal"/>
+        <w:bidi w:val="0"/>
+        <w:spacing w:before="0" w:beforeAutospacing="off" w:after="160" w:afterAutospacing="off" w:line="279" w:lineRule="auto"/>
+        <w:ind w:left="708" w:right="0" w:firstLine="0"/>
+        <w:jc w:val="left"/>
+      </w:pPr>
+      <w:r>
+        <w:drawing>
+          <wp:inline wp14:editId="3352D755" wp14:anchorId="187A6AAC">
+            <wp:extent cx="4629796" cy="1686160"/>
+            <wp:effectExtent l="0" t="0" r="0" b="0"/>
+            <wp:docPr id="429572824" name="drawing"/>
+            <wp:cNvGraphicFramePr>
+              <a:graphicFrameLocks noChangeAspect="1"/>
+            </wp:cNvGraphicFramePr>
+            <a:graphic>
+              <a:graphicData xmlns:a="http://schemas.openxmlformats.org/drawingml/2006/main" uri="http://schemas.openxmlformats.org/drawingml/2006/picture">
+                <pic:pic xmlns:pic="http://schemas.openxmlformats.org/drawingml/2006/picture">
+                  <pic:nvPicPr>
+                    <pic:cNvPr id="429572824" name="Picture 429572824"/>
+                    <pic:cNvPicPr/>
+                  </pic:nvPicPr>
+                  <pic:blipFill>
+                    <a:blip xmlns:r="http://schemas.openxmlformats.org/officeDocument/2006/relationships" r:embed="rId534841378">
+                      <a:extLst>
+                        <a:ext uri="{28A0092B-C50C-407E-A947-70E740481C1C}">
+                          <a14:useLocalDpi xmlns:a14="http://schemas.microsoft.com/office/drawing/2010/main"/>
+                        </a:ext>
+                      </a:extLst>
+                    </a:blip>
+                    <a:stretch>
+                      <a:fillRect/>
+                    </a:stretch>
+                  </pic:blipFill>
+                  <pic:spPr>
+                    <a:xfrm>
+                      <a:off x="0" y="0"/>
+                      <a:ext cx="4629796" cy="1686160"/>
+                    </a:xfrm>
+                    <a:prstGeom prst="rect">
+                      <a:avLst/>
+                    </a:prstGeom>
+                  </pic:spPr>
+                </pic:pic>
+              </a:graphicData>
+            </a:graphic>
+          </wp:inline>
+        </w:drawing>
+      </w:r>
+    </w:p>
+    <w:p>
+      <w:pPr>
+        <w:pStyle w:val="Normal"/>
+        <w:bidi w:val="0"/>
+        <w:spacing w:before="0" w:beforeAutospacing="off" w:after="160" w:afterAutospacing="off" w:line="279" w:lineRule="auto"/>
+        <w:ind w:left="708" w:right="0" w:firstLine="0"/>
+        <w:jc w:val="left"/>
+      </w:pPr>
+      <w:r>
+        <w:rPr/>
+        <w:t>5.</w:t>
+      </w:r>
+    </w:p>
+    <w:p>
+      <w:pPr>
+        <w:pStyle w:val="Normal"/>
+        <w:bidi w:val="0"/>
+        <w:spacing w:before="0" w:beforeAutospacing="off" w:after="160" w:afterAutospacing="off" w:line="279" w:lineRule="auto"/>
+        <w:ind w:left="708" w:right="0" w:firstLine="0"/>
+        <w:jc w:val="left"/>
+      </w:pPr>
+      <w:r>
+        <w:drawing>
+          <wp:inline wp14:editId="67C1E7BC" wp14:anchorId="29801E34">
+            <wp:extent cx="4134427" cy="1524132"/>
+            <wp:effectExtent l="0" t="0" r="0" b="0"/>
+            <wp:docPr id="1394021732" name="drawing"/>
+            <wp:cNvGraphicFramePr>
+              <a:graphicFrameLocks noChangeAspect="1"/>
+            </wp:cNvGraphicFramePr>
+            <a:graphic>
+              <a:graphicData xmlns:a="http://schemas.openxmlformats.org/drawingml/2006/main" uri="http://schemas.openxmlformats.org/drawingml/2006/picture">
+                <pic:pic xmlns:pic="http://schemas.openxmlformats.org/drawingml/2006/picture">
+                  <pic:nvPicPr>
+                    <pic:cNvPr id="1394021732" name="Picture 1394021732"/>
+                    <pic:cNvPicPr/>
+                  </pic:nvPicPr>
+                  <pic:blipFill>
+                    <a:blip xmlns:r="http://schemas.openxmlformats.org/officeDocument/2006/relationships" r:embed="rId152618192">
+                      <a:extLst>
+                        <a:ext uri="{28A0092B-C50C-407E-A947-70E740481C1C}">
+                          <a14:useLocalDpi xmlns:a14="http://schemas.microsoft.com/office/drawing/2010/main"/>
+                        </a:ext>
+                      </a:extLst>
+                    </a:blip>
+                    <a:stretch>
+                      <a:fillRect/>
+                    </a:stretch>
+                  </pic:blipFill>
+                  <pic:spPr>
+                    <a:xfrm rot="0">
+                      <a:off x="0" y="0"/>
+                      <a:ext cx="4134427" cy="1524132"/>
+                    </a:xfrm>
+                    <a:prstGeom prst="rect">
+                      <a:avLst/>
+                    </a:prstGeom>
+                  </pic:spPr>
+                </pic:pic>
+              </a:graphicData>
+            </a:graphic>
+          </wp:inline>
+        </w:drawing>
+      </w:r>
+    </w:p>
+    <w:p>
+      <w:pPr>
+        <w:pStyle w:val="Normal"/>
+        <w:bidi w:val="0"/>
+        <w:spacing w:before="0" w:beforeAutospacing="off" w:after="160" w:afterAutospacing="off" w:line="279" w:lineRule="auto"/>
+        <w:ind w:left="708" w:right="0" w:firstLine="0"/>
+        <w:jc w:val="left"/>
+      </w:pPr>
+    </w:p>
+    <w:p>
+      <w:r>
+        <w:br w:type="page"/>
+      </w:r>
+    </w:p>
+    <w:p>
+      <w:pPr>
+        <w:pStyle w:val="Normal"/>
+        <w:bidi w:val="0"/>
+        <w:spacing w:before="0" w:beforeAutospacing="off" w:after="160" w:afterAutospacing="off" w:line="279" w:lineRule="auto"/>
+        <w:ind w:left="708" w:right="0" w:firstLine="0"/>
+        <w:jc w:val="left"/>
+      </w:pPr>
+      <w:r>
+        <w:drawing>
+          <wp:inline wp14:editId="2D4FB5BD" wp14:anchorId="706D3211">
+            <wp:extent cx="5725324" cy="1419423"/>
+            <wp:effectExtent l="0" t="0" r="0" b="0"/>
+            <wp:docPr id="516378822" name="drawing"/>
+            <wp:cNvGraphicFramePr>
+              <a:graphicFrameLocks noChangeAspect="1"/>
+            </wp:cNvGraphicFramePr>
+            <a:graphic>
+              <a:graphicData xmlns:a="http://schemas.openxmlformats.org/drawingml/2006/main" uri="http://schemas.openxmlformats.org/drawingml/2006/picture">
+                <pic:pic xmlns:pic="http://schemas.openxmlformats.org/drawingml/2006/picture">
+                  <pic:nvPicPr>
+                    <pic:cNvPr id="516378822" name="Picture 516378822"/>
+                    <pic:cNvPicPr/>
+                  </pic:nvPicPr>
+                  <pic:blipFill>
+                    <a:blip xmlns:r="http://schemas.openxmlformats.org/officeDocument/2006/relationships" r:embed="rId1049286451">
+                      <a:extLst>
+                        <a:ext uri="{28A0092B-C50C-407E-A947-70E740481C1C}">
+                          <a14:useLocalDpi xmlns:a14="http://schemas.microsoft.com/office/drawing/2010/main"/>
+                        </a:ext>
+                      </a:extLst>
+                    </a:blip>
+                    <a:stretch>
+                      <a:fillRect/>
+                    </a:stretch>
+                  </pic:blipFill>
+                  <pic:spPr>
+                    <a:xfrm>
+                      <a:off x="0" y="0"/>
+                      <a:ext cx="5725324" cy="1419423"/>
+                    </a:xfrm>
+                    <a:prstGeom prst="rect">
+                      <a:avLst/>
+                    </a:prstGeom>
+                  </pic:spPr>
+                </pic:pic>
+              </a:graphicData>
+            </a:graphic>
+          </wp:inline>
+        </w:drawing>
+      </w:r>
+    </w:p>
+    <w:p>
+      <w:pPr>
+        <w:pStyle w:val="Normal"/>
+        <w:bidi w:val="0"/>
+        <w:spacing w:before="0" w:beforeAutospacing="off" w:after="160" w:afterAutospacing="off" w:line="279" w:lineRule="auto"/>
+        <w:ind w:left="708" w:right="0" w:firstLine="0"/>
+        <w:jc w:val="left"/>
+      </w:pPr>
+    </w:p>
+    <w:p>
+      <w:pPr>
+        <w:pStyle w:val="Normal"/>
+        <w:bidi w:val="0"/>
+        <w:spacing w:before="0" w:beforeAutospacing="off" w:after="160" w:afterAutospacing="off" w:line="279" w:lineRule="auto"/>
+        <w:ind w:left="0" w:right="0" w:firstLine="0"/>
+        <w:jc w:val="left"/>
+      </w:pPr>
     </w:p>
     <w:sectPr>
       <w:pgSz w:w="11906" w:h="16838" w:orient="portrait"/>
@@ -622,6 +1164,99 @@
     </w:sectPr>
   </w:body>
 </w:document>
+</file>
+
+<file path=word/numbering.xml><?xml version="1.0" encoding="utf-8"?>
+<w:numbering xmlns:w="http://schemas.openxmlformats.org/wordprocessingml/2006/main">
+  <w:abstractNum xmlns:w="http://schemas.openxmlformats.org/wordprocessingml/2006/main" w:abstractNumId="1">
+    <w:nsid w:val="4489f708"/>
+    <w:multiLevelType xmlns:w="http://schemas.openxmlformats.org/wordprocessingml/2006/main" w:val="hybridMultilevel"/>
+    <w:lvl xmlns:w="http://schemas.openxmlformats.org/wordprocessingml/2006/main" w:ilvl="0">
+      <w:start w:val="1"/>
+      <w:numFmt w:val="decimal"/>
+      <w:lvlText w:val="%1."/>
+      <w:lvlJc w:val="left"/>
+      <w:pPr>
+        <w:ind w:left="720" w:hanging="360"/>
+      </w:pPr>
+    </w:lvl>
+    <w:lvl xmlns:w="http://schemas.openxmlformats.org/wordprocessingml/2006/main" w:ilvl="1">
+      <w:start w:val="1"/>
+      <w:numFmt w:val="lowerLetter"/>
+      <w:lvlText w:val="%2."/>
+      <w:lvlJc w:val="left"/>
+      <w:pPr>
+        <w:ind w:left="1440" w:hanging="360"/>
+      </w:pPr>
+    </w:lvl>
+    <w:lvl xmlns:w="http://schemas.openxmlformats.org/wordprocessingml/2006/main" w:ilvl="2">
+      <w:start w:val="1"/>
+      <w:numFmt w:val="lowerRoman"/>
+      <w:lvlText w:val="%3."/>
+      <w:lvlJc w:val="right"/>
+      <w:pPr>
+        <w:ind w:left="2160" w:hanging="180"/>
+      </w:pPr>
+    </w:lvl>
+    <w:lvl xmlns:w="http://schemas.openxmlformats.org/wordprocessingml/2006/main" w:ilvl="3">
+      <w:start w:val="1"/>
+      <w:numFmt w:val="decimal"/>
+      <w:lvlText w:val="%4."/>
+      <w:lvlJc w:val="left"/>
+      <w:pPr>
+        <w:ind w:left="2880" w:hanging="360"/>
+      </w:pPr>
+    </w:lvl>
+    <w:lvl xmlns:w="http://schemas.openxmlformats.org/wordprocessingml/2006/main" w:ilvl="4">
+      <w:start w:val="1"/>
+      <w:numFmt w:val="lowerLetter"/>
+      <w:lvlText w:val="%5."/>
+      <w:lvlJc w:val="left"/>
+      <w:pPr>
+        <w:ind w:left="3600" w:hanging="360"/>
+      </w:pPr>
+    </w:lvl>
+    <w:lvl xmlns:w="http://schemas.openxmlformats.org/wordprocessingml/2006/main" w:ilvl="5">
+      <w:start w:val="1"/>
+      <w:numFmt w:val="lowerRoman"/>
+      <w:lvlText w:val="%6."/>
+      <w:lvlJc w:val="right"/>
+      <w:pPr>
+        <w:ind w:left="4320" w:hanging="180"/>
+      </w:pPr>
+    </w:lvl>
+    <w:lvl xmlns:w="http://schemas.openxmlformats.org/wordprocessingml/2006/main" w:ilvl="6">
+      <w:start w:val="1"/>
+      <w:numFmt w:val="decimal"/>
+      <w:lvlText w:val="%7."/>
+      <w:lvlJc w:val="left"/>
+      <w:pPr>
+        <w:ind w:left="5040" w:hanging="360"/>
+      </w:pPr>
+    </w:lvl>
+    <w:lvl xmlns:w="http://schemas.openxmlformats.org/wordprocessingml/2006/main" w:ilvl="7">
+      <w:start w:val="1"/>
+      <w:numFmt w:val="lowerLetter"/>
+      <w:lvlText w:val="%8."/>
+      <w:lvlJc w:val="left"/>
+      <w:pPr>
+        <w:ind w:left="5760" w:hanging="360"/>
+      </w:pPr>
+    </w:lvl>
+    <w:lvl xmlns:w="http://schemas.openxmlformats.org/wordprocessingml/2006/main" w:ilvl="8">
+      <w:start w:val="1"/>
+      <w:numFmt w:val="lowerRoman"/>
+      <w:lvlText w:val="%9."/>
+      <w:lvlJc w:val="right"/>
+      <w:pPr>
+        <w:ind w:left="6480" w:hanging="180"/>
+      </w:pPr>
+    </w:lvl>
+  </w:abstractNum>
+  <w:num w:numId="1">
+    <w:abstractNumId w:val="1"/>
+  </w:num>
+</w:numbering>
 </file>
 
 <file path=word/styles.xml><?xml version="1.0" encoding="utf-8"?>
@@ -1045,6 +1680,18 @@
     <w:semiHidden/>
     <w:unhideWhenUsed/>
   </w:style>
+  <w:style w:type="paragraph" w:styleId="ListParagraph">
+    <w:uiPriority w:val="34"/>
+    <w:name w:val="List Paragraph"/>
+    <w:basedOn w:val="Normal"/>
+    <w:qFormat/>
+    <w:rsid w:val="57E42FF5"/>
+    <w:pPr>
+      <w:spacing/>
+      <w:ind w:left="720"/>
+      <w:contextualSpacing/>
+    </w:pPr>
+  </w:style>
 </w:styles>
 </file>
 

</xml_diff>